<commit_message>
Complete circular MCF benchmark results, report and restoration package
</commit_message>
<xml_diff>
--- a/docs/methods/FAST_四类求解器方法卡.docx
+++ b/docs/methods/FAST_四类求解器方法卡.docx
@@ -11,6 +11,19 @@
       </w:r>
     </w:p>
     <w:p>
+      <w:r>
+        <w:t>核对日期：2026-10-03。当前实现说明；本轮圆形数值结果另见正式汇报。</w:t>
+      </w:r>
+    </w:p>
+    <w:p>
+      <w:pPr>
+        <w:pStyle w:val="Heading1"/>
+      </w:pPr>
+      <w:r>
+        <w:t>公共定义</w:t>
+      </w:r>
+    </w:p>
+    <w:p>
       <w:pPr>
         <w:pStyle w:val="Heading2"/>
       </w:pPr>
@@ -20,7 +33,7 @@
     </w:p>
     <w:p>
       <w:r>
-        <w:t>依据课题说明 v1.0 第03节“每个方法必须有一张方法卡”。本卡核对当前 MATLAB 实现及 fast_four_solver_config.m；参数为工程试运行默认值，未进行开发集调优。圆形端面修正代码已准备并通过静态检查，两类 MCF 数值重跑待验证，旧结果仅作历史架构验证。</w:t>
+        <w:t>依据课题说明 v1.0 第03节“每个方法必须有一张方法卡”。本卡核对当前 MATLAB 实现及 fast_four_solver_config.m；参数为工程试运行默认值，未进行开发集调优。圆形端面修正与两类 MCF 数值重跑已通过；本轮四求解器16/16完成，旧结果保留为历史架构验证。</w:t>
       </w:r>
     </w:p>
     <w:p>
@@ -102,13 +115,8 @@
       </w:r>
     </w:p>
     <w:p>
-      <w:r>
-        <w:br w:type="page"/>
-      </w:r>
-    </w:p>
-    <w:p>
       <w:pPr>
-        <w:pStyle w:val="Title"/>
+        <w:pStyle w:val="Heading1"/>
       </w:pPr>
       <w:r>
         <w:t>FAST/HIO</w:t>
@@ -116,7 +124,7 @@
     </w:p>
     <w:p>
       <w:r>
-        <w:t>共同输入、变量、约束和初始化：见首页公共定义。当前代码核对版，2026-10-03。</w:t>
+        <w:t>变量、输入、约束、初始化及公共预算沿用上面的公共定义；以下补充方法特定内容。</w:t>
       </w:r>
     </w:p>
     <w:p>
@@ -198,13 +206,8 @@
       </w:r>
     </w:p>
     <w:p>
-      <w:r>
-        <w:br w:type="page"/>
-      </w:r>
-    </w:p>
-    <w:p>
       <w:pPr>
-        <w:pStyle w:val="Title"/>
+        <w:pStyle w:val="Heading1"/>
       </w:pPr>
       <w:r>
         <w:t>ER / 支持域交替投影</w:t>
@@ -212,7 +215,7 @@
     </w:p>
     <w:p>
       <w:r>
-        <w:t>共同输入、变量、约束和初始化：见首页公共定义。当前代码核对版，2026-10-03。</w:t>
+        <w:t>变量、输入、约束、初始化及公共预算沿用上面的公共定义；以下补充方法特定内容。</w:t>
       </w:r>
     </w:p>
     <w:p>
@@ -294,13 +297,8 @@
       </w:r>
     </w:p>
     <w:p>
-      <w:r>
-        <w:br w:type="page"/>
-      </w:r>
-    </w:p>
-    <w:p>
       <w:pPr>
-        <w:pStyle w:val="Title"/>
+        <w:pStyle w:val="Heading1"/>
       </w:pPr>
       <w:r>
         <w:t>RAAR</w:t>
@@ -308,7 +306,7 @@
     </w:p>
     <w:p>
       <w:r>
-        <w:t>共同输入、变量、约束和初始化：见首页公共定义。当前代码核对版，2026-10-03。</w:t>
+        <w:t>变量、输入、约束、初始化及公共预算沿用上面的公共定义；以下补充方法特定内容。</w:t>
       </w:r>
     </w:p>
     <w:p>
@@ -390,13 +388,8 @@
       </w:r>
     </w:p>
     <w:p>
-      <w:r>
-        <w:br w:type="page"/>
-      </w:r>
-    </w:p>
-    <w:p>
       <w:pPr>
-        <w:pStyle w:val="Title"/>
+        <w:pStyle w:val="Heading1"/>
       </w:pPr>
       <w:r>
         <w:t>幅值损失 + L-BFGS</w:t>
@@ -404,7 +397,7 @@
     </w:p>
     <w:p>
       <w:r>
-        <w:t>共同输入、变量、约束和初始化：见首页公共定义。当前代码核对版，2026-10-03。</w:t>
+        <w:t>变量、输入、约束、初始化及公共预算沿用上面的公共定义；以下补充方法特定内容。</w:t>
       </w:r>
     </w:p>
     <w:p>
@@ -525,8 +518,8 @@
       </w:r>
     </w:p>
     <w:sectPr>
-      <w:pgSz w:w="12240" w:h="15840"/>
-      <w:pgMar w:top="1440" w:right="1800" w:bottom="1440" w:left="1800" w:header="720" w:footer="720" w:gutter="0"/>
+      <w:pgSz w:w="16838" w:h="11906"/>
+      <w:pgMar w:top="794" w:right="850" w:bottom="794" w:left="850" w:header="720" w:footer="720" w:gutter="0"/>
       <w:cols w:space="720"/>
       <w:docGrid w:linePitch="360"/>
     </w:sectPr>
@@ -961,11 +954,11 @@
       <w:outlineLvl w:val="0"/>
     </w:pPr>
     <w:rPr>
-      <w:rFonts w:asciiTheme="majorHAnsi" w:eastAsiaTheme="majorEastAsia" w:hAnsiTheme="majorHAnsi" w:cstheme="majorBidi"/>
+      <w:rFonts w:asciiTheme="majorHAnsi" w:eastAsiaTheme="majorEastAsia" w:hAnsiTheme="majorHAnsi" w:cstheme="majorBidi" w:ascii="Calibri" w:hAnsi="Calibri" w:eastAsia="Microsoft YaHei"/>
       <w:b/>
       <w:bCs/>
       <w:color w:val="365F91" w:themeColor="accent1" w:themeShade="BF"/>
-      <w:sz w:val="28"/>
+      <w:sz w:val="26"/>
       <w:szCs w:val="28"/>
     </w:rPr>
   </w:style>
@@ -985,7 +978,7 @@
       <w:outlineLvl w:val="1"/>
     </w:pPr>
     <w:rPr>
-      <w:rFonts w:asciiTheme="majorHAnsi" w:eastAsiaTheme="majorEastAsia" w:hAnsiTheme="majorHAnsi" w:cstheme="majorBidi"/>
+      <w:rFonts w:asciiTheme="majorHAnsi" w:eastAsiaTheme="majorEastAsia" w:hAnsiTheme="majorHAnsi" w:cstheme="majorBidi" w:ascii="Calibri" w:hAnsi="Calibri" w:eastAsia="Microsoft YaHei"/>
       <w:b/>
       <w:bCs/>
       <w:color w:val="4F81BD" w:themeColor="accent1"/>
@@ -1009,10 +1002,11 @@
       <w:outlineLvl w:val="2"/>
     </w:pPr>
     <w:rPr>
-      <w:rFonts w:asciiTheme="majorHAnsi" w:eastAsiaTheme="majorEastAsia" w:hAnsiTheme="majorHAnsi" w:cstheme="majorBidi"/>
+      <w:rFonts w:asciiTheme="majorHAnsi" w:eastAsiaTheme="majorEastAsia" w:hAnsiTheme="majorHAnsi" w:cstheme="majorBidi" w:ascii="Calibri" w:hAnsi="Calibri" w:eastAsia="Microsoft YaHei"/>
       <w:b/>
       <w:bCs/>
       <w:color w:val="4F81BD" w:themeColor="accent1"/>
+      <w:sz w:val="26"/>
     </w:rPr>
   </w:style>
   <w:style w:type="paragraph" w:styleId="Heading4">
@@ -1250,11 +1244,11 @@
       <w:contextualSpacing/>
     </w:pPr>
     <w:rPr>
-      <w:rFonts w:asciiTheme="majorHAnsi" w:eastAsiaTheme="majorEastAsia" w:hAnsiTheme="majorHAnsi" w:cstheme="majorBidi"/>
+      <w:rFonts w:asciiTheme="majorHAnsi" w:eastAsiaTheme="majorEastAsia" w:hAnsiTheme="majorHAnsi" w:cstheme="majorBidi" w:ascii="Calibri" w:hAnsi="Calibri" w:eastAsia="Microsoft YaHei"/>
       <w:color w:val="17365D" w:themeColor="text2" w:themeShade="BF"/>
       <w:spacing w:val="5"/>
       <w:kern w:val="28"/>
-      <w:sz w:val="52"/>
+      <w:sz w:val="40"/>
       <w:szCs w:val="52"/>
     </w:rPr>
   </w:style>

</xml_diff>